<commit_message>
docs: separate engineering archives and finish user documentation
</commit_message>
<xml_diff>
--- a/docs/application-notes/AN_APIO_001_WS2812_Rev1.0_FR.docx
+++ b/docs/application-notes/AN_APIO_001_WS2812_Rev1.0_FR.docx
@@ -2624,92 +2624,485 @@
         <w:pStyle w:val="Heading1"/>
       </w:pPr>
       <w:r>
-        <w:t>7 Vérification de l’application</w:t>
+        <w:t>7 Vérification sur carte</w:t>
       </w:r>
     </w:p>
     <w:p>
       <w:r>
-        <w:t>Le banc de test envoie 12 trames de 120 bits : un mot remplacé et quatre mots relayés. Il vérifie les captures SPI, le nombre et la valeur des bits DOUT, leurs largeurs, les mises à jour atomiques, IRQ/ACK et l’exécution simultanée d’un programme PIO sur une autre broche. Il exerce les retenues et le rebouclage du compteur 24 bits, ainsi que les trames sans demande d’incrément.</w:t>
+        <w:t>Contrôler CLK, DIN et DOUT à l’oscilloscope, après vérification des niveaux électriques et des adaptations de tension. Pour le profil de cette note, les durées hautes nominales sont 320 ns et 640 ns. Mesurer aussi les durées basses et les intervalles de reset ; les comparer à la fiche des LED utilisées.</w:t>
+      </w:r>
+    </w:p>
+    <w:tbl>
+      <w:tblPr>
+        <w:tblW w:type="auto" w:w="0"/>
+        <w:jc w:val="center"/>
+        <w:tblLayout w:type="fixed"/>
+        <w:tblLook w:firstColumn="1" w:firstRow="1" w:lastColumn="0" w:lastRow="0" w:noHBand="0" w:noVBand="1" w:val="04A0"/>
+      </w:tblPr>
+      <w:tblGrid>
+        <w:gridCol w:w="3888"/>
+        <w:gridCol w:w="6336"/>
+      </w:tblGrid>
+      <w:tr>
+        <w:trPr>
+          <w:cantSplit/>
+          <w:tblHeader/>
+        </w:trPr>
+        <w:tc>
+          <w:tcPr>
+            <w:tcW w:type="dxa" w:w="3888"/>
+            <w:vAlign w:val="center"/>
+            <w:tcBorders>
+              <w:top w:val="single" w:sz="4" w:color="D9D9D9"/>
+              <w:left w:val="single" w:sz="4" w:color="D9D9D9"/>
+              <w:bottom w:val="single" w:sz="4" w:color="D9D9D9"/>
+              <w:right w:val="single" w:sz="4" w:color="D9D9D9"/>
+            </w:tcBorders>
+            <w:shd w:fill="17324D"/>
+            <w:tcMar>
+              <w:top w:w="90" w:type="dxa"/>
+              <w:bottom w:w="90" w:type="dxa"/>
+              <w:left w:w="90" w:type="dxa"/>
+              <w:right w:w="90" w:type="dxa"/>
+            </w:tcMar>
+          </w:tcPr>
+          <w:p>
+            <w:pPr>
+              <w:spacing w:after="80" w:before="80" w:line="245" w:lineRule="auto"/>
+            </w:pPr>
+            <w:r>
+              <w:rPr>
+                <w:b/>
+                <w:color w:val="FFFFFF"/>
+                <w:sz w:val="19"/>
+              </w:rPr>
+              <w:t>Essai</w:t>
+            </w:r>
+          </w:p>
+        </w:tc>
+        <w:tc>
+          <w:tcPr>
+            <w:tcW w:type="dxa" w:w="6336"/>
+            <w:vAlign w:val="center"/>
+            <w:tcBorders>
+              <w:top w:val="single" w:sz="4" w:color="D9D9D9"/>
+              <w:left w:val="single" w:sz="4" w:color="D9D9D9"/>
+              <w:bottom w:val="single" w:sz="4" w:color="D9D9D9"/>
+              <w:right w:val="single" w:sz="4" w:color="D9D9D9"/>
+            </w:tcBorders>
+            <w:shd w:fill="17324D"/>
+            <w:tcMar>
+              <w:top w:w="90" w:type="dxa"/>
+              <w:bottom w:w="90" w:type="dxa"/>
+              <w:left w:w="90" w:type="dxa"/>
+              <w:right w:w="90" w:type="dxa"/>
+            </w:tcMar>
+          </w:tcPr>
+          <w:p>
+            <w:pPr>
+              <w:spacing w:after="80" w:before="80" w:line="245" w:lineRule="auto"/>
+            </w:pPr>
+            <w:r>
+              <w:rPr>
+                <w:b/>
+                <w:color w:val="FFFFFF"/>
+                <w:sz w:val="19"/>
+              </w:rPr>
+              <w:t>Résultat attendu</w:t>
+            </w:r>
+          </w:p>
+        </w:tc>
+      </w:tr>
+      <w:tr>
+        <w:trPr>
+          <w:cantSplit/>
+        </w:trPr>
+        <w:tc>
+          <w:tcPr>
+            <w:tcW w:type="dxa" w:w="3888"/>
+            <w:vAlign w:val="center"/>
+            <w:tcBorders>
+              <w:top w:val="single" w:sz="4" w:color="D9D9D9"/>
+              <w:left w:val="single" w:sz="4" w:color="D9D9D9"/>
+              <w:bottom w:val="single" w:sz="4" w:color="D9D9D9"/>
+              <w:right w:val="single" w:sz="4" w:color="D9D9D9"/>
+            </w:tcBorders>
+            <w:shd w:fill="F1F4F6"/>
+            <w:tcMar>
+              <w:top w:w="90" w:type="dxa"/>
+              <w:bottom w:w="90" w:type="dxa"/>
+              <w:left w:w="90" w:type="dxa"/>
+              <w:right w:w="90" w:type="dxa"/>
+            </w:tcMar>
+          </w:tcPr>
+          <w:p>
+            <w:pPr>
+              <w:spacing w:after="80" w:before="80" w:line="245" w:lineRule="auto"/>
+            </w:pPr>
+            <w:r>
+              <w:rPr>
+                <w:sz w:val="19"/>
+              </w:rPr>
+              <w:t xml:space="preserve">Préfixes </w:t>
+            </w:r>
+            <w:r>
+              <w:rPr>
+                <w:rFonts w:ascii="DejaVu Sans Mono" w:hAnsi="DejaVu Sans Mono"/>
+                <w:sz w:val="19"/>
+              </w:rPr>
+              <w:t>000000</w:t>
+            </w:r>
+            <w:r>
+              <w:rPr>
+                <w:sz w:val="19"/>
+              </w:rPr>
+              <w:t xml:space="preserve">, </w:t>
+            </w:r>
+            <w:r>
+              <w:rPr>
+                <w:rFonts w:ascii="DejaVu Sans Mono" w:hAnsi="DejaVu Sans Mono"/>
+                <w:sz w:val="19"/>
+              </w:rPr>
+              <w:t>FFFFFF</w:t>
+            </w:r>
+            <w:r>
+              <w:rPr>
+                <w:sz w:val="19"/>
+              </w:rPr>
+              <w:t xml:space="preserve">, </w:t>
+            </w:r>
+            <w:r>
+              <w:rPr>
+                <w:rFonts w:ascii="DejaVu Sans Mono" w:hAnsi="DejaVu Sans Mono"/>
+                <w:sz w:val="19"/>
+              </w:rPr>
+              <w:t>AAAAAA</w:t>
+            </w:r>
+            <w:r>
+              <w:rPr>
+                <w:sz w:val="19"/>
+              </w:rPr>
+              <w:t xml:space="preserve">, </w:t>
+            </w:r>
+            <w:r>
+              <w:rPr>
+                <w:rFonts w:ascii="DejaVu Sans Mono" w:hAnsi="DejaVu Sans Mono"/>
+                <w:sz w:val="19"/>
+              </w:rPr>
+              <w:t>555555</w:t>
+            </w:r>
+            <w:r>
+              <w:rPr>
+                <w:sz w:val="19"/>
+              </w:rPr>
+            </w:r>
+          </w:p>
+        </w:tc>
+        <w:tc>
+          <w:tcPr>
+            <w:tcW w:type="dxa" w:w="6336"/>
+            <w:vAlign w:val="center"/>
+            <w:tcBorders>
+              <w:top w:val="single" w:sz="4" w:color="D9D9D9"/>
+              <w:left w:val="single" w:sz="4" w:color="D9D9D9"/>
+              <w:bottom w:val="single" w:sz="4" w:color="D9D9D9"/>
+              <w:right w:val="single" w:sz="4" w:color="D9D9D9"/>
+            </w:tcBorders>
+            <w:shd w:fill="F1F4F6"/>
+            <w:tcMar>
+              <w:top w:w="90" w:type="dxa"/>
+              <w:bottom w:w="90" w:type="dxa"/>
+              <w:left w:w="90" w:type="dxa"/>
+              <w:right w:w="90" w:type="dxa"/>
+            </w:tcMar>
+          </w:tcPr>
+          <w:p>
+            <w:pPr>
+              <w:spacing w:after="80" w:before="80" w:line="245" w:lineRule="auto"/>
+            </w:pPr>
+            <w:r>
+              <w:rPr>
+                <w:sz w:val="19"/>
+              </w:rPr>
+              <w:t>Capture SPI égale au premier mot DIN ; premier mot DOUT égal à la valeur préparée</w:t>
+            </w:r>
+          </w:p>
+        </w:tc>
+      </w:tr>
+      <w:tr>
+        <w:trPr>
+          <w:cantSplit/>
+        </w:trPr>
+        <w:tc>
+          <w:tcPr>
+            <w:tcW w:type="dxa" w:w="3888"/>
+            <w:vAlign w:val="center"/>
+            <w:tcBorders>
+              <w:top w:val="single" w:sz="4" w:color="D9D9D9"/>
+              <w:left w:val="single" w:sz="4" w:color="D9D9D9"/>
+              <w:bottom w:val="single" w:sz="4" w:color="D9D9D9"/>
+              <w:right w:val="single" w:sz="4" w:color="D9D9D9"/>
+            </w:tcBorders>
+            <w:shd w:fill="FFFFFF"/>
+            <w:tcMar>
+              <w:top w:w="90" w:type="dxa"/>
+              <w:bottom w:w="90" w:type="dxa"/>
+              <w:left w:w="90" w:type="dxa"/>
+              <w:right w:w="90" w:type="dxa"/>
+            </w:tcMar>
+          </w:tcPr>
+          <w:p>
+            <w:pPr>
+              <w:spacing w:after="80" w:before="80" w:line="245" w:lineRule="auto"/>
+            </w:pPr>
+            <w:r>
+              <w:rPr>
+                <w:sz w:val="19"/>
+              </w:rPr>
+              <w:t>Longue suite de mots après le préfixe</w:t>
+            </w:r>
+          </w:p>
+        </w:tc>
+        <w:tc>
+          <w:tcPr>
+            <w:tcW w:type="dxa" w:w="6336"/>
+            <w:vAlign w:val="center"/>
+            <w:tcBorders>
+              <w:top w:val="single" w:sz="4" w:color="D9D9D9"/>
+              <w:left w:val="single" w:sz="4" w:color="D9D9D9"/>
+              <w:bottom w:val="single" w:sz="4" w:color="D9D9D9"/>
+              <w:right w:val="single" w:sz="4" w:color="D9D9D9"/>
+            </w:tcBorders>
+            <w:shd w:fill="FFFFFF"/>
+            <w:tcMar>
+              <w:top w:w="90" w:type="dxa"/>
+              <w:bottom w:w="90" w:type="dxa"/>
+              <w:left w:w="90" w:type="dxa"/>
+              <w:right w:w="90" w:type="dxa"/>
+            </w:tcMar>
+          </w:tcPr>
+          <w:p>
+            <w:pPr>
+              <w:spacing w:after="80" w:before="80" w:line="245" w:lineRule="auto"/>
+            </w:pPr>
+            <w:r>
+              <w:rPr>
+                <w:sz w:val="19"/>
+              </w:rPr>
+              <w:t>Nombre de bits conservé ; données suivantes inchangées</w:t>
+            </w:r>
+          </w:p>
+        </w:tc>
+      </w:tr>
+      <w:tr>
+        <w:trPr>
+          <w:cantSplit/>
+        </w:trPr>
+        <w:tc>
+          <w:tcPr>
+            <w:tcW w:type="dxa" w:w="3888"/>
+            <w:vAlign w:val="center"/>
+            <w:tcBorders>
+              <w:top w:val="single" w:sz="4" w:color="D9D9D9"/>
+              <w:left w:val="single" w:sz="4" w:color="D9D9D9"/>
+              <w:bottom w:val="single" w:sz="4" w:color="D9D9D9"/>
+              <w:right w:val="single" w:sz="4" w:color="D9D9D9"/>
+            </w:tcBorders>
+            <w:shd w:fill="F1F4F6"/>
+            <w:tcMar>
+              <w:top w:w="90" w:type="dxa"/>
+              <w:bottom w:w="90" w:type="dxa"/>
+              <w:left w:w="90" w:type="dxa"/>
+              <w:right w:w="90" w:type="dxa"/>
+            </w:tcMar>
+          </w:tcPr>
+          <w:p>
+            <w:pPr>
+              <w:spacing w:after="80" w:before="80" w:line="245" w:lineRule="auto"/>
+            </w:pPr>
+            <w:r>
+              <w:rPr>
+                <w:sz w:val="19"/>
+              </w:rPr>
+              <w:t>COMMIT accepté pendant une trame</w:t>
+            </w:r>
+          </w:p>
+        </w:tc>
+        <w:tc>
+          <w:tcPr>
+            <w:tcW w:type="dxa" w:w="6336"/>
+            <w:vAlign w:val="center"/>
+            <w:tcBorders>
+              <w:top w:val="single" w:sz="4" w:color="D9D9D9"/>
+              <w:left w:val="single" w:sz="4" w:color="D9D9D9"/>
+              <w:bottom w:val="single" w:sz="4" w:color="D9D9D9"/>
+              <w:right w:val="single" w:sz="4" w:color="D9D9D9"/>
+            </w:tcBorders>
+            <w:shd w:fill="F1F4F6"/>
+            <w:tcMar>
+              <w:top w:w="90" w:type="dxa"/>
+              <w:bottom w:w="90" w:type="dxa"/>
+              <w:left w:w="90" w:type="dxa"/>
+              <w:right w:w="90" w:type="dxa"/>
+            </w:tcMar>
+          </w:tcPr>
+          <w:p>
+            <w:pPr>
+              <w:spacing w:after="80" w:before="80" w:line="245" w:lineRule="auto"/>
+            </w:pPr>
+            <w:r>
+              <w:rPr>
+                <w:sz w:val="19"/>
+              </w:rPr>
+              <w:t>Mot sortant courant inchangé ; remplacement à une frontière de trame qualifiée suivante</w:t>
+            </w:r>
+          </w:p>
+        </w:tc>
+      </w:tr>
+      <w:tr>
+        <w:trPr>
+          <w:cantSplit/>
+        </w:trPr>
+        <w:tc>
+          <w:tcPr>
+            <w:tcW w:type="dxa" w:w="3888"/>
+            <w:vAlign w:val="center"/>
+            <w:tcBorders>
+              <w:top w:val="single" w:sz="4" w:color="D9D9D9"/>
+              <w:left w:val="single" w:sz="4" w:color="D9D9D9"/>
+              <w:bottom w:val="single" w:sz="4" w:color="D9D9D9"/>
+              <w:right w:val="single" w:sz="4" w:color="D9D9D9"/>
+            </w:tcBorders>
+            <w:shd w:fill="FFFFFF"/>
+            <w:tcMar>
+              <w:top w:w="90" w:type="dxa"/>
+              <w:bottom w:w="90" w:type="dxa"/>
+              <w:left w:w="90" w:type="dxa"/>
+              <w:right w:w="90" w:type="dxa"/>
+            </w:tcMar>
+          </w:tcPr>
+          <w:p>
+            <w:pPr>
+              <w:spacing w:after="80" w:before="80" w:line="245" w:lineRule="auto"/>
+            </w:pPr>
+            <w:r>
+              <w:rPr>
+                <w:sz w:val="19"/>
+              </w:rPr>
+              <w:t>Aucune nouvelle valeur préparée</w:t>
+            </w:r>
+          </w:p>
+        </w:tc>
+        <w:tc>
+          <w:tcPr>
+            <w:tcW w:type="dxa" w:w="6336"/>
+            <w:vAlign w:val="center"/>
+            <w:tcBorders>
+              <w:top w:val="single" w:sz="4" w:color="D9D9D9"/>
+              <w:left w:val="single" w:sz="4" w:color="D9D9D9"/>
+              <w:bottom w:val="single" w:sz="4" w:color="D9D9D9"/>
+              <w:right w:val="single" w:sz="4" w:color="D9D9D9"/>
+            </w:tcBorders>
+            <w:shd w:fill="FFFFFF"/>
+            <w:tcMar>
+              <w:top w:w="90" w:type="dxa"/>
+              <w:bottom w:w="90" w:type="dxa"/>
+              <w:left w:w="90" w:type="dxa"/>
+              <w:right w:w="90" w:type="dxa"/>
+            </w:tcMar>
+          </w:tcPr>
+          <w:p>
+            <w:pPr>
+              <w:spacing w:after="80" w:before="80" w:line="245" w:lineRule="auto"/>
+            </w:pPr>
+            <w:r>
+              <w:rPr>
+                <w:sz w:val="19"/>
+              </w:rPr>
+              <w:t>Réutilisation du mot actif à chaque trame</w:t>
+            </w:r>
+          </w:p>
+        </w:tc>
+      </w:tr>
+      <w:tr>
+        <w:trPr>
+          <w:cantSplit/>
+        </w:trPr>
+        <w:tc>
+          <w:tcPr>
+            <w:tcW w:type="dxa" w:w="3888"/>
+            <w:vAlign w:val="center"/>
+            <w:tcBorders>
+              <w:top w:val="single" w:sz="4" w:color="D9D9D9"/>
+              <w:left w:val="single" w:sz="4" w:color="D9D9D9"/>
+              <w:bottom w:val="single" w:sz="4" w:color="D9D9D9"/>
+              <w:right w:val="single" w:sz="4" w:color="D9D9D9"/>
+            </w:tcBorders>
+            <w:shd w:fill="F1F4F6"/>
+            <w:tcMar>
+              <w:top w:w="90" w:type="dxa"/>
+              <w:bottom w:w="90" w:type="dxa"/>
+              <w:left w:w="90" w:type="dxa"/>
+              <w:right w:w="90" w:type="dxa"/>
+            </w:tcMar>
+          </w:tcPr>
+          <w:p>
+            <w:pPr>
+              <w:spacing w:after="80" w:before="80" w:line="245" w:lineRule="auto"/>
+            </w:pPr>
+            <w:r>
+              <w:rPr>
+                <w:sz w:val="19"/>
+              </w:rPr>
+              <w:t>Hôte retardé au-delà de la trame suivante</w:t>
+            </w:r>
+          </w:p>
+        </w:tc>
+        <w:tc>
+          <w:tcPr>
+            <w:tcW w:type="dxa" w:w="6336"/>
+            <w:vAlign w:val="center"/>
+            <w:tcBorders>
+              <w:top w:val="single" w:sz="4" w:color="D9D9D9"/>
+              <w:left w:val="single" w:sz="4" w:color="D9D9D9"/>
+              <w:bottom w:val="single" w:sz="4" w:color="D9D9D9"/>
+              <w:right w:val="single" w:sz="4" w:color="D9D9D9"/>
+            </w:tcBorders>
+            <w:shd w:fill="F1F4F6"/>
+            <w:tcMar>
+              <w:top w:w="90" w:type="dxa"/>
+              <w:bottom w:w="90" w:type="dxa"/>
+              <w:left w:w="90" w:type="dxa"/>
+              <w:right w:w="90" w:type="dxa"/>
+            </w:tcMar>
+          </w:tcPr>
+          <w:p>
+            <w:pPr>
+              <w:spacing w:after="80" w:before="80" w:line="245" w:lineRule="auto"/>
+            </w:pPr>
+            <w:r>
+              <w:rPr>
+                <w:sz w:val="19"/>
+              </w:rPr>
+              <w:t>Ancienne capture conservée ; RX_OVERRUN signalé ; nouvelle capture ignorée</w:t>
+            </w:r>
+          </w:p>
+        </w:tc>
+      </w:tr>
+    </w:tbl>
+    <w:p>
+      <w:pPr>
+        <w:spacing w:after="0"/>
+      </w:pPr>
+    </w:p>
+    <w:p>
+      <w:r>
+        <w:t>Lire les deux pages d’état, vérifier IRQ et acquitter les captures après leur copie dans l’application. Tester la récupération d’erreur décrite dans le manuel, ainsi que le redémarrage après reset global. Le pilote doit recharger la configuration ; un simple arrêt du moteur ne la réinitialise pas.</w:t>
       </w:r>
     </w:p>
     <w:p>
       <w:r>
-        <w:t>Le rejeu de référence passe 12 scénarios en RTL et 12 sur la netlist routée, avec 1 440 bits de sortie vérifiés par mode dans le scénario compteur. Les deux modèles donnent les mêmes observations. Ce sont des simulations fonctionnelles sans SDF, avec un modèle SPI de l’hôte, pas un LPC réel.</w:t>
-      </w:r>
-    </w:p>
-    <w:p>
-      <w:pPr>
-        <w:spacing w:after="40" w:line="240" w:lineRule="auto"/>
-      </w:pPr>
-      <w:r>
-        <w:rPr>
-          <w:rFonts w:ascii="DejaVu Sans Mono" w:hAnsi="DejaVu Sans Mono"/>
-          <w:sz w:val="17"/>
-        </w:rPr>
-        <w:t>python3 tools/check_final_release.py</w:t>
-      </w:r>
-    </w:p>
-    <w:p>
-      <w:pPr>
-        <w:spacing w:after="40" w:line="240" w:lineRule="auto"/>
-      </w:pPr>
-      <w:r>
-        <w:rPr>
-          <w:rFonts w:ascii="DejaVu Sans Mono" w:hAnsi="DejaVu Sans Mono"/>
-          <w:sz w:val="17"/>
-        </w:rPr>
-        <w:t>make -C test/ws2812 MODE=rtl</w:t>
-      </w:r>
-    </w:p>
-    <w:p>
-      <w:pPr>
-        <w:spacing w:after="40" w:line="240" w:lineRule="auto"/>
-      </w:pPr>
-      <w:r>
-        <w:rPr>
-          <w:rFonts w:ascii="DejaVu Sans Mono" w:hAnsi="DejaVu Sans Mono"/>
-          <w:sz w:val="17"/>
-        </w:rPr>
-        <w:t>python3 tools/check_results.py work/ws2812-counter-replay/rtl/results.xml</w:t>
-      </w:r>
-    </w:p>
-    <w:p>
-      <w:pPr>
-        <w:spacing w:after="40" w:line="240" w:lineRule="auto"/>
-      </w:pPr>
-      <w:r>
-        <w:rPr>
-          <w:rFonts w:ascii="DejaVu Sans Mono" w:hAnsi="DejaVu Sans Mono"/>
-          <w:sz w:val="17"/>
-        </w:rPr>
-        <w:t>make -C test/ws2812 MODE=gl</w:t>
-      </w:r>
-    </w:p>
-    <w:p>
-      <w:pPr>
-        <w:spacing w:after="40" w:line="240" w:lineRule="auto"/>
-      </w:pPr>
-      <w:r>
-        <w:rPr>
-          <w:rFonts w:ascii="DejaVu Sans Mono" w:hAnsi="DejaVu Sans Mono"/>
-          <w:sz w:val="17"/>
-        </w:rPr>
-        <w:t>python3 tools/check_results.py work/ws2812-counter-replay/gl/results.xml</w:t>
-      </w:r>
-    </w:p>
-    <w:p>
-      <w:r>
-        <w:t xml:space="preserve">Installer d’abord Icarus Verilog 13 et les dépendances de </w:t>
-      </w:r>
-      <w:r>
-        <w:rPr>
-          <w:rFonts w:ascii="DejaVu Sans Mono" w:hAnsi="DejaVu Sans Mono"/>
-          <w:sz w:val="18"/>
-        </w:rPr>
-        <w:t>test/requirements.txt</w:t>
-      </w:r>
-      <w:r>
-        <w:t xml:space="preserve"> dans un environnement Python. Les commandes sont détaillées dans le </w:t>
+        <w:t xml:space="preserve">La validation fonctionnelle de référence couvre 12 scénarios en RTL et 12 sur la netlist routée, dont un scénario compteur de 12 trames et 1 440 bits de sortie par mode. Ces simulations sont sans SDF, avec un modèle SPI de l’hôte, et ne remplacent pas la qualification électrique sur carte. Les outils, dépendances et commandes de reproduction sont dans le </w:t>
       </w:r>
       <w:hyperlink r:id="rId15">
         <w:r>
@@ -2721,51 +3114,6 @@
       </w:hyperlink>
       <w:r>
         <w:t>.</w:t>
-      </w:r>
-    </w:p>
-    <w:p>
-      <w:r>
-        <w:t xml:space="preserve">Sur carte, contrôler à l’oscilloscope CLK, DIN et DOUT, les durées hautes et basses, le reset de trame et les niveaux électriques. Essayer des préfixes </w:t>
-      </w:r>
-      <w:r>
-        <w:rPr>
-          <w:rFonts w:ascii="DejaVu Sans Mono" w:hAnsi="DejaVu Sans Mono"/>
-          <w:sz w:val="18"/>
-        </w:rPr>
-        <w:t>000000</w:t>
-      </w:r>
-      <w:r>
-        <w:t xml:space="preserve">, </w:t>
-      </w:r>
-      <w:r>
-        <w:rPr>
-          <w:rFonts w:ascii="DejaVu Sans Mono" w:hAnsi="DejaVu Sans Mono"/>
-          <w:sz w:val="18"/>
-        </w:rPr>
-        <w:t>FFFFFF</w:t>
-      </w:r>
-      <w:r>
-        <w:t xml:space="preserve">, </w:t>
-      </w:r>
-      <w:r>
-        <w:rPr>
-          <w:rFonts w:ascii="DejaVu Sans Mono" w:hAnsi="DejaVu Sans Mono"/>
-          <w:sz w:val="18"/>
-        </w:rPr>
-        <w:t>AAAAAA</w:t>
-      </w:r>
-      <w:r>
-        <w:t xml:space="preserve">, </w:t>
-      </w:r>
-      <w:r>
-        <w:rPr>
-          <w:rFonts w:ascii="DejaVu Sans Mono" w:hAnsi="DejaVu Sans Mono"/>
-          <w:sz w:val="18"/>
-        </w:rPr>
-        <w:t>555555</w:t>
-      </w:r>
-      <w:r>
-        <w:t>, une longue suite inchangée, des mises à jour pendant la trame et un hôte volontairement retardé. Vérifier les compteurs d’erreurs logiciels et le comportement de récupération avant d’utiliser le montage dans l’application.</w:t>
       </w:r>
     </w:p>
     <w:p>

</xml_diff>